<commit_message>
adding new letures, topic and guide for answering some assigment
</commit_message>
<xml_diff>
--- a/Materi/Kapita Selekta/Template Proposal TA.docx
+++ b/Materi/Kapita Selekta/Template Proposal TA.docx
@@ -912,8 +912,8 @@
         <w:tblLook w:val="04A0" w:firstRow="1" w:lastRow="0" w:firstColumn="1" w:lastColumn="0" w:noHBand="0" w:noVBand="1"/>
       </w:tblPr>
       <w:tblGrid>
-        <w:gridCol w:w="4585"/>
-        <w:gridCol w:w="4410"/>
+        <w:gridCol w:w="4079"/>
+        <w:gridCol w:w="3848"/>
       </w:tblGrid>
       <w:tr>
         <w:tc>
@@ -1170,7 +1170,7 @@
         <w:tblLook w:val="04A0" w:firstRow="1" w:lastRow="0" w:firstColumn="1" w:lastColumn="0" w:noHBand="0" w:noVBand="1"/>
       </w:tblPr>
       <w:tblGrid>
-        <w:gridCol w:w="8995"/>
+        <w:gridCol w:w="7927"/>
       </w:tblGrid>
       <w:tr>
         <w:trPr>
@@ -1251,8 +1251,8 @@
         <w:tblLook w:val="04A0" w:firstRow="1" w:lastRow="0" w:firstColumn="1" w:lastColumn="0" w:noHBand="0" w:noVBand="1"/>
       </w:tblPr>
       <w:tblGrid>
-        <w:gridCol w:w="4675"/>
-        <w:gridCol w:w="4320"/>
+        <w:gridCol w:w="4127"/>
+        <w:gridCol w:w="3810"/>
       </w:tblGrid>
       <w:tr>
         <w:trPr>
@@ -1281,6 +1281,7 @@
                 <w:szCs w:val="24"/>
                 <w:lang w:val="en-US"/>
               </w:rPr>
+              <w:lastRenderedPageBreak/>
               <w:t>Bandung</w:t>
             </w:r>
             <w:r>
@@ -1611,7 +1612,7 @@
         <w:tblLook w:val="04A0" w:firstRow="1" w:lastRow="0" w:firstColumn="1" w:lastColumn="0" w:noHBand="0" w:noVBand="1"/>
       </w:tblPr>
       <w:tblGrid>
-        <w:gridCol w:w="9016"/>
+        <w:gridCol w:w="7927"/>
       </w:tblGrid>
       <w:tr>
         <w:tc>
@@ -1689,7 +1690,7 @@
         <w:tblLook w:val="04A0" w:firstRow="1" w:lastRow="0" w:firstColumn="1" w:lastColumn="0" w:noHBand="0" w:noVBand="1"/>
       </w:tblPr>
       <w:tblGrid>
-        <w:gridCol w:w="9016"/>
+        <w:gridCol w:w="7927"/>
       </w:tblGrid>
       <w:tr>
         <w:tc>
@@ -1733,7 +1734,7 @@
         <w:tblLook w:val="04A0" w:firstRow="1" w:lastRow="0" w:firstColumn="1" w:lastColumn="0" w:noHBand="0" w:noVBand="1"/>
       </w:tblPr>
       <w:tblGrid>
-        <w:gridCol w:w="9016"/>
+        <w:gridCol w:w="7927"/>
       </w:tblGrid>
       <w:tr>
         <w:tc>
@@ -1784,7 +1785,7 @@
         <w:tblLook w:val="04A0" w:firstRow="1" w:lastRow="0" w:firstColumn="1" w:lastColumn="0" w:noHBand="0" w:noVBand="1"/>
       </w:tblPr>
       <w:tblGrid>
-        <w:gridCol w:w="9016"/>
+        <w:gridCol w:w="7927"/>
       </w:tblGrid>
       <w:tr>
         <w:tc>
@@ -1835,7 +1836,7 @@
         <w:tblLook w:val="04A0" w:firstRow="1" w:lastRow="0" w:firstColumn="1" w:lastColumn="0" w:noHBand="0" w:noVBand="1"/>
       </w:tblPr>
       <w:tblGrid>
-        <w:gridCol w:w="9016"/>
+        <w:gridCol w:w="7927"/>
       </w:tblGrid>
       <w:tr>
         <w:tc>
@@ -1874,6 +1875,7 @@
         <w:t>PENDAHULUAN</w:t>
       </w:r>
     </w:p>
+    <w:p/>
     <w:p/>
     <w:tbl>
       <w:tblPr>
@@ -1882,7 +1884,7 @@
         <w:tblLook w:val="04A0" w:firstRow="1" w:lastRow="0" w:firstColumn="1" w:lastColumn="0" w:noHBand="0" w:noVBand="1"/>
       </w:tblPr>
       <w:tblGrid>
-        <w:gridCol w:w="9016"/>
+        <w:gridCol w:w="7927"/>
       </w:tblGrid>
       <w:tr>
         <w:tc>
@@ -1910,6 +1912,92 @@
       <w:r>
         <w:t>Latar Belakang Masalah</w:t>
       </w:r>
+    </w:p>
+    <w:p>
+      <w:pPr>
+        <w:pStyle w:val="ListParagraph"/>
+        <w:ind w:left="360"/>
+        <w:jc w:val="both"/>
+        <w:rPr>
+          <w:lang w:val="en-ID"/>
+        </w:rPr>
+      </w:pPr>
+      <w:r>
+        <w:rPr>
+          <w:lang w:val="en-ID"/>
+        </w:rPr>
+        <w:t xml:space="preserve">Kegiatan penjualan dan pengelolaan persediaan pada Toko Bangunan TB </w:t>
+      </w:r>
+      <w:r>
+        <w:rPr>
+          <w:lang w:val="en-ID"/>
+        </w:rPr>
+        <w:t xml:space="preserve">Bintek </w:t>
+      </w:r>
+      <w:r>
+        <w:rPr>
+          <w:lang w:val="en-ID"/>
+        </w:rPr>
+        <w:t>masih didukung oleh catatan manual berupa bon dan buku keuangan. Berdasarkan penjelasan awal dari pihak toko, buku keuangan mencatat barang yang dijual serta membedakan nominal yang belum diterima atau belum dikonfirmasi dengan nominal yang telah diterima. Perubahan status penerimaan uang juga ditandai secara manual pada catatan tersebut. Cara pencatatan ini perlu dipahami secara rinci agar hubungan antara transaksi penjualan dan pembayarannya dapat direpresentasikan dengan tepat dalam sistem.</w:t>
+      </w:r>
+    </w:p>
+    <w:p>
+      <w:pPr>
+        <w:pStyle w:val="ListParagraph"/>
+        <w:ind w:left="360"/>
+        <w:jc w:val="both"/>
+        <w:rPr>
+          <w:lang w:val="en-ID"/>
+        </w:rPr>
+      </w:pPr>
+      <w:r>
+        <w:rPr>
+          <w:lang w:val="en-ID"/>
+        </w:rPr>
+        <w:t>Berdasarkan wawancara awal, jumlah stok barang saat ini diketahui melalui perkiraan, sedangkan jumlah barang yang datang belum dicatat secara teratur. Kebutuhan pengisian ulang barang sering diketahui ketika barang telah habis atau ketika pelanggan hendak membelinya. Kondisi tersebut menunjukkan perlunya mekanisme pencatatan stok awal, barang masuk, dan barang keluar yang dapat ditelusuri. Akan tetapi, karena catatan persediaan historis belum lengkap, jumlah stok pada masa lalu tidak dapat langsung direkonstruksi secara akurat dari bon penjualan saja.</w:t>
+      </w:r>
+    </w:p>
+    <w:p>
+      <w:pPr>
+        <w:pStyle w:val="ListParagraph"/>
+        <w:ind w:left="360"/>
+        <w:jc w:val="both"/>
+        <w:rPr>
+          <w:lang w:val="en-ID"/>
+        </w:rPr>
+      </w:pPr>
+      <w:r>
+        <w:rPr>
+          <w:lang w:val="en-ID"/>
+        </w:rPr>
+        <w:t xml:space="preserve">Berdasarkan kondisi tersebut, penelitian ini diarahkan pada perancangan sistem informasi manajemen persediaan dan penjualan berbasis web untuk TB </w:t>
+      </w:r>
+      <w:r>
+        <w:rPr>
+          <w:lang w:val="en-ID"/>
+        </w:rPr>
+        <w:t>Bintek</w:t>
+      </w:r>
+      <w:r>
+        <w:rPr>
+          <w:lang w:val="en-ID"/>
+        </w:rPr>
+        <w:t xml:space="preserve">. Rancangan sistem akan mempertimbangkan alur pencatatan yang digunakan toko, termasuk variasi satuan barang dan perbedaan antara penjualan dengan penerimaan pembayaran. Evaluasi sistem direncanakan menggunakan stok awal hasil penghitungan fisik serta transaksi yang dicatat selama periode uji, </w:t>
+      </w:r>
+      <w:r>
+        <w:rPr>
+          <w:lang w:val="en-ID"/>
+        </w:rPr>
+        <w:lastRenderedPageBreak/>
+        <w:t>kemudian membandingkan keluaran sistem dengan dokumen transaksi dan kondisi barang yang diperiksa di toko.</w:t>
+      </w:r>
+    </w:p>
+    <w:p>
+      <w:pPr>
+        <w:pStyle w:val="ListParagraph"/>
+        <w:ind w:left="360"/>
+        <w:jc w:val="both"/>
+      </w:pPr>
     </w:p>
     <w:tbl>
       <w:tblPr>
@@ -1919,7 +2007,7 @@
         <w:tblLook w:val="04A0" w:firstRow="1" w:lastRow="0" w:firstColumn="1" w:lastColumn="0" w:noHBand="0" w:noVBand="1"/>
       </w:tblPr>
       <w:tblGrid>
-        <w:gridCol w:w="8656"/>
+        <w:gridCol w:w="7567"/>
       </w:tblGrid>
       <w:tr>
         <w:tc>
@@ -1965,7 +2053,7 @@
         <w:tblLook w:val="04A0" w:firstRow="1" w:lastRow="0" w:firstColumn="1" w:lastColumn="0" w:noHBand="0" w:noVBand="1"/>
       </w:tblPr>
       <w:tblGrid>
-        <w:gridCol w:w="8656"/>
+        <w:gridCol w:w="7567"/>
       </w:tblGrid>
       <w:tr>
         <w:tc>
@@ -2011,7 +2099,7 @@
         <w:tblLook w:val="04A0" w:firstRow="1" w:lastRow="0" w:firstColumn="1" w:lastColumn="0" w:noHBand="0" w:noVBand="1"/>
       </w:tblPr>
       <w:tblGrid>
-        <w:gridCol w:w="8656"/>
+        <w:gridCol w:w="7567"/>
       </w:tblGrid>
       <w:tr>
         <w:tc>
@@ -2057,7 +2145,7 @@
         <w:tblLook w:val="04A0" w:firstRow="1" w:lastRow="0" w:firstColumn="1" w:lastColumn="0" w:noHBand="0" w:noVBand="1"/>
       </w:tblPr>
       <w:tblGrid>
-        <w:gridCol w:w="8656"/>
+        <w:gridCol w:w="7567"/>
       </w:tblGrid>
       <w:tr>
         <w:tc>
@@ -2103,7 +2191,7 @@
         <w:tblLook w:val="04A0" w:firstRow="1" w:lastRow="0" w:firstColumn="1" w:lastColumn="0" w:noHBand="0" w:noVBand="1"/>
       </w:tblPr>
       <w:tblGrid>
-        <w:gridCol w:w="8656"/>
+        <w:gridCol w:w="7567"/>
       </w:tblGrid>
       <w:tr>
         <w:tc>
@@ -2156,7 +2244,7 @@
         <w:tblLook w:val="04A0" w:firstRow="1" w:lastRow="0" w:firstColumn="1" w:lastColumn="0" w:noHBand="0" w:noVBand="1"/>
       </w:tblPr>
       <w:tblGrid>
-        <w:gridCol w:w="9016"/>
+        <w:gridCol w:w="7927"/>
       </w:tblGrid>
       <w:tr>
         <w:tc>
@@ -2188,7 +2276,7 @@
         <w:tblLook w:val="04A0" w:firstRow="1" w:lastRow="0" w:firstColumn="1" w:lastColumn="0" w:noHBand="0" w:noVBand="1"/>
       </w:tblPr>
       <w:tblGrid>
-        <w:gridCol w:w="9016"/>
+        <w:gridCol w:w="7927"/>
       </w:tblGrid>
       <w:tr>
         <w:tc>
@@ -2217,7 +2305,7 @@
         <w:tblLook w:val="04A0" w:firstRow="1" w:lastRow="0" w:firstColumn="1" w:lastColumn="0" w:noHBand="0" w:noVBand="1"/>
       </w:tblPr>
       <w:tblGrid>
-        <w:gridCol w:w="9016"/>
+        <w:gridCol w:w="7927"/>
       </w:tblGrid>
       <w:tr>
         <w:tc>
@@ -2266,7 +2354,7 @@
         <w:tblLook w:val="04A0" w:firstRow="1" w:lastRow="0" w:firstColumn="1" w:lastColumn="0" w:noHBand="0" w:noVBand="1"/>
       </w:tblPr>
       <w:tblGrid>
-        <w:gridCol w:w="9016"/>
+        <w:gridCol w:w="7927"/>
       </w:tblGrid>
       <w:tr>
         <w:tc>
@@ -2295,7 +2383,7 @@
         <w:tblLook w:val="04A0" w:firstRow="1" w:lastRow="0" w:firstColumn="1" w:lastColumn="0" w:noHBand="0" w:noVBand="1"/>
       </w:tblPr>
       <w:tblGrid>
-        <w:gridCol w:w="9016"/>
+        <w:gridCol w:w="7927"/>
       </w:tblGrid>
       <w:tr>
         <w:tc>
@@ -2324,7 +2412,7 @@
         <w:tblLook w:val="04A0" w:firstRow="1" w:lastRow="0" w:firstColumn="1" w:lastColumn="0" w:noHBand="0" w:noVBand="1"/>
       </w:tblPr>
       <w:tblGrid>
-        <w:gridCol w:w="9016"/>
+        <w:gridCol w:w="7927"/>
       </w:tblGrid>
       <w:tr>
         <w:tc>
@@ -2370,7 +2458,7 @@
         <w:tblLook w:val="04A0" w:firstRow="1" w:lastRow="0" w:firstColumn="1" w:lastColumn="0" w:noHBand="0" w:noVBand="1"/>
       </w:tblPr>
       <w:tblGrid>
-        <w:gridCol w:w="9016"/>
+        <w:gridCol w:w="7927"/>
       </w:tblGrid>
       <w:tr>
         <w:tc>
@@ -2413,7 +2501,7 @@
         <w:tblLook w:val="04A0" w:firstRow="1" w:lastRow="0" w:firstColumn="1" w:lastColumn="0" w:noHBand="0" w:noVBand="1"/>
       </w:tblPr>
       <w:tblGrid>
-        <w:gridCol w:w="9016"/>
+        <w:gridCol w:w="7927"/>
       </w:tblGrid>
       <w:tr>
         <w:tc>
@@ -2435,7 +2523,7 @@
       <w:headerReference w:type="default" r:id="rId8"/>
       <w:headerReference w:type="first" r:id="rId9"/>
       <w:pgSz w:w="11906" w:h="16838" w:code="9"/>
-      <w:pgMar w:top="1440" w:right="1440" w:bottom="1440" w:left="1440" w:header="270" w:footer="708" w:gutter="0"/>
+      <w:pgMar w:top="2268" w:right="1701" w:bottom="1701" w:left="2268" w:header="274" w:footer="706" w:gutter="0"/>
       <w:cols w:space="708"/>
       <w:titlePg/>
       <w:docGrid w:linePitch="360"/>
@@ -3246,6 +3334,7 @@
   <w:style w:type="character" w:default="1" w:styleId="DefaultParagraphFont">
     <w:name w:val="Default Paragraph Font"/>
     <w:uiPriority w:val="1"/>
+    <w:semiHidden/>
     <w:unhideWhenUsed/>
   </w:style>
   <w:style w:type="table" w:default="1" w:styleId="TableNormal">

</xml_diff>